<commit_message>
Complete Lab 7 and add root guides
- Lab 7: fix Keras 3 InputLayer crash in neural_net (93.8% test acc),
  nn_experiments (8 hyperparameter configs, best 97.25%), nn_pytorch
  (97.6%), TF+PyTorch install check, Week 7 worklog, guides
- Lab 9: Task 2 setup-check script; Lab 8/9 screenshot READMEs
- Root README, Anas.md, CLAUDE.md, requirements.txt
- Worklog builder: keep figures/screenshot boxes with their captions

Co-Authored-By: Claude Opus 5.5 <noreply@anthropic.com>
Claude-Session: https://claude.ai/code/session_0189EmTvdNp75fbiYJaiwSjL
</commit_message>
<xml_diff>
--- a/Lab 5/Lab5_Worklog_Week5.docx
+++ b/Lab 5/Lab5_Worklog_Week5.docx
@@ -3769,6 +3769,7 @@
     </w:p>
     <w:p>
       <w:pPr>
+        <w:keepNext/>
         <w:spacing w:before="120" w:after="40"/>
         <w:jc w:val="center"/>
       </w:pPr>
@@ -3824,6 +3825,7 @@
     </w:p>
     <w:p>
       <w:pPr>
+        <w:keepNext/>
         <w:spacing w:before="120" w:after="40"/>
         <w:jc w:val="center"/>
       </w:pPr>
@@ -3879,6 +3881,7 @@
     </w:p>
     <w:p>
       <w:pPr>
+        <w:keepNext/>
         <w:spacing w:before="120" w:after="40"/>
         <w:jc w:val="center"/>
       </w:pPr>
@@ -3958,6 +3961,7 @@
           </w:tcPr>
           <w:p>
             <w:pPr>
+              <w:keepNext/>
               <w:spacing w:before="80" w:after="40"/>
             </w:pPr>
             <w:r>
@@ -3982,6 +3986,7 @@
           </w:p>
           <w:p>
             <w:pPr>
+              <w:keepNext/>
               <w:spacing w:before="0" w:after="40"/>
             </w:pPr>
             <w:r>
@@ -4014,6 +4019,7 @@
           </w:p>
           <w:p>
             <w:pPr>
+              <w:keepNext/>
               <w:spacing w:before="0" w:after="80"/>
             </w:pPr>
             <w:r>
@@ -4106,6 +4112,7 @@
           </w:tcPr>
           <w:p>
             <w:pPr>
+              <w:keepNext/>
               <w:spacing w:before="80" w:after="40"/>
             </w:pPr>
             <w:r>
@@ -4130,6 +4137,7 @@
           </w:p>
           <w:p>
             <w:pPr>
+              <w:keepNext/>
               <w:spacing w:before="0" w:after="40"/>
             </w:pPr>
             <w:r>
@@ -4162,6 +4170,7 @@
           </w:p>
           <w:p>
             <w:pPr>
+              <w:keepNext/>
               <w:spacing w:before="0" w:after="80"/>
             </w:pPr>
             <w:r>
@@ -4254,6 +4263,7 @@
           </w:tcPr>
           <w:p>
             <w:pPr>
+              <w:keepNext/>
               <w:spacing w:before="80" w:after="40"/>
             </w:pPr>
             <w:r>
@@ -4278,6 +4288,7 @@
           </w:p>
           <w:p>
             <w:pPr>
+              <w:keepNext/>
               <w:spacing w:before="0" w:after="40"/>
             </w:pPr>
             <w:r>
@@ -4346,6 +4357,7 @@
           </w:p>
           <w:p>
             <w:pPr>
+              <w:keepNext/>
               <w:spacing w:before="0" w:after="80"/>
             </w:pPr>
             <w:r>
@@ -4438,6 +4450,7 @@
           </w:tcPr>
           <w:p>
             <w:pPr>
+              <w:keepNext/>
               <w:spacing w:before="80" w:after="40"/>
             </w:pPr>
             <w:r>
@@ -4462,6 +4475,7 @@
           </w:p>
           <w:p>
             <w:pPr>
+              <w:keepNext/>
               <w:spacing w:before="0" w:after="40"/>
             </w:pPr>
             <w:r>
@@ -4548,6 +4562,7 @@
           </w:p>
           <w:p>
             <w:pPr>
+              <w:keepNext/>
               <w:spacing w:before="0" w:after="80"/>
             </w:pPr>
             <w:r>
@@ -4640,6 +4655,7 @@
           </w:tcPr>
           <w:p>
             <w:pPr>
+              <w:keepNext/>
               <w:spacing w:before="80" w:after="40"/>
             </w:pPr>
             <w:r>
@@ -4664,6 +4680,7 @@
           </w:p>
           <w:p>
             <w:pPr>
+              <w:keepNext/>
               <w:spacing w:before="0" w:after="40"/>
             </w:pPr>
             <w:r>
@@ -4714,6 +4731,7 @@
           </w:p>
           <w:p>
             <w:pPr>
+              <w:keepNext/>
               <w:spacing w:before="0" w:after="80"/>
             </w:pPr>
             <w:r>
@@ -4806,6 +4824,7 @@
           </w:tcPr>
           <w:p>
             <w:pPr>
+              <w:keepNext/>
               <w:spacing w:before="80" w:after="40"/>
             </w:pPr>
             <w:r>
@@ -4830,6 +4849,7 @@
           </w:p>
           <w:p>
             <w:pPr>
+              <w:keepNext/>
               <w:spacing w:before="0" w:after="40"/>
             </w:pPr>
             <w:r>
@@ -4880,6 +4900,7 @@
           </w:p>
           <w:p>
             <w:pPr>
+              <w:keepNext/>
               <w:spacing w:before="0" w:after="80"/>
             </w:pPr>
             <w:r>
@@ -4972,6 +4993,7 @@
           </w:tcPr>
           <w:p>
             <w:pPr>
+              <w:keepNext/>
               <w:spacing w:before="80" w:after="40"/>
             </w:pPr>
             <w:r>
@@ -4996,6 +5018,7 @@
           </w:p>
           <w:p>
             <w:pPr>
+              <w:keepNext/>
               <w:spacing w:before="0" w:after="40"/>
             </w:pPr>
             <w:r>
@@ -5010,6 +5033,7 @@
           </w:p>
           <w:p>
             <w:pPr>
+              <w:keepNext/>
               <w:spacing w:before="0" w:after="80"/>
             </w:pPr>
             <w:r>

</xml_diff>

<commit_message>
Verification pass: Word-safe XML order, notebook fixes, exact screenshot lines
- Insert tblBorders/tblLayout/shd in OOXML schema order (Word is strict;
  checked every worklog + the Lab 8 summary with an order validator)
- Re-run pca_extras (outputs had been cleared); Lab 9 notebook bumped to
  nbformat 4.5 so the new cells' ids validate
- Correct the gradient-descent blow-up wording in Lab 5
- Screenshot instructions now give exact cell line ranges (Labs 6, 7, 9)

Co-Authored-By: Claude Opus 5.5 <noreply@anthropic.com>
Claude-Session: https://claude.ai/code/session_0189EmTvdNp75fbiYJaiwSjL
</commit_message>
<xml_diff>
--- a/Lab 5/Lab5_Worklog_Week5.docx
+++ b/Lab 5/Lab5_Worklog_Week5.docx
@@ -264,7 +264,6 @@
       <w:tblPr>
         <w:tblStyle w:val="TableGrid"/>
         <w:tblW w:type="dxa" w:w="8965"/>
-        <w:tblLook w:firstColumn="1" w:firstRow="1" w:lastColumn="0" w:lastRow="0" w:noHBand="0" w:noVBand="1" w:val="04A0"/>
         <w:tblBorders>
           <w:top w:val="single" w:sz="4" w:space="0" w:color="808080"/>
           <w:left w:val="single" w:sz="4" w:space="0" w:color="808080"/>
@@ -274,6 +273,7 @@
           <w:insideV w:val="single" w:sz="4" w:space="0" w:color="808080"/>
         </w:tblBorders>
         <w:tblLayout w:type="fixed"/>
+        <w:tblLook w:firstColumn="1" w:firstRow="1" w:lastColumn="0" w:lastRow="0" w:noHBand="0" w:noVBand="1" w:val="04A0"/>
       </w:tblPr>
       <w:tblGrid>
         <w:gridCol w:w="520"/>
@@ -3624,7 +3624,7 @@
                 <w:i w:val="0"/>
                 <w:sz w:val="17"/>
               </w:rPr>
-              <w:t>GD on the raw areas (~1000s) blew up to 1e205 / nan within 20 iterations. Fixed by standardising the feature (z-score) and converting the weights back afterwards.</w:t>
+              <w:t>GD on the raw areas (~1000s) blew up to a cost of ~1e205 within just 20 iterations. Fixed by standardising the feature (z-score) and converting the weights back afterwards.</w:t>
             </w:r>
           </w:p>
         </w:tc>
@@ -3939,7 +3939,6 @@
       <w:tblPr>
         <w:tblStyle w:val="TableGrid"/>
         <w:tblW w:type="dxa" w:w="8965"/>
-        <w:tblLook w:firstColumn="1" w:firstRow="1" w:lastColumn="0" w:lastRow="0" w:noHBand="0" w:noVBand="1" w:val="04A0"/>
         <w:tblBorders>
           <w:top w:val="dashed" w:sz="8" w:space="0" w:color="BF8F00"/>
           <w:left w:val="dashed" w:sz="8" w:space="0" w:color="BF8F00"/>
@@ -3949,6 +3948,7 @@
           <w:insideV w:val="dashed" w:sz="8" w:space="0" w:color="BF8F00"/>
         </w:tblBorders>
         <w:tblLayout w:type="fixed"/>
+        <w:tblLook w:firstColumn="1" w:firstRow="1" w:lastColumn="0" w:lastRow="0" w:noHBand="0" w:noVBand="1" w:val="04A0"/>
       </w:tblPr>
       <w:tblGrid>
         <w:gridCol w:w="8965"/>
@@ -4090,7 +4090,6 @@
       <w:tblPr>
         <w:tblStyle w:val="TableGrid"/>
         <w:tblW w:type="dxa" w:w="8965"/>
-        <w:tblLook w:firstColumn="1" w:firstRow="1" w:lastColumn="0" w:lastRow="0" w:noHBand="0" w:noVBand="1" w:val="04A0"/>
         <w:tblBorders>
           <w:top w:val="dashed" w:sz="8" w:space="0" w:color="BF8F00"/>
           <w:left w:val="dashed" w:sz="8" w:space="0" w:color="BF8F00"/>
@@ -4100,6 +4099,7 @@
           <w:insideV w:val="dashed" w:sz="8" w:space="0" w:color="BF8F00"/>
         </w:tblBorders>
         <w:tblLayout w:type="fixed"/>
+        <w:tblLook w:firstColumn="1" w:firstRow="1" w:lastColumn="0" w:lastRow="0" w:noHBand="0" w:noVBand="1" w:val="04A0"/>
       </w:tblPr>
       <w:tblGrid>
         <w:gridCol w:w="8965"/>
@@ -4241,7 +4241,6 @@
       <w:tblPr>
         <w:tblStyle w:val="TableGrid"/>
         <w:tblW w:type="dxa" w:w="8965"/>
-        <w:tblLook w:firstColumn="1" w:firstRow="1" w:lastColumn="0" w:lastRow="0" w:noHBand="0" w:noVBand="1" w:val="04A0"/>
         <w:tblBorders>
           <w:top w:val="dashed" w:sz="8" w:space="0" w:color="BF8F00"/>
           <w:left w:val="dashed" w:sz="8" w:space="0" w:color="BF8F00"/>
@@ -4251,6 +4250,7 @@
           <w:insideV w:val="dashed" w:sz="8" w:space="0" w:color="BF8F00"/>
         </w:tblBorders>
         <w:tblLayout w:type="fixed"/>
+        <w:tblLook w:firstColumn="1" w:firstRow="1" w:lastColumn="0" w:lastRow="0" w:noHBand="0" w:noVBand="1" w:val="04A0"/>
       </w:tblPr>
       <w:tblGrid>
         <w:gridCol w:w="8965"/>
@@ -4428,7 +4428,6 @@
       <w:tblPr>
         <w:tblStyle w:val="TableGrid"/>
         <w:tblW w:type="dxa" w:w="8965"/>
-        <w:tblLook w:firstColumn="1" w:firstRow="1" w:lastColumn="0" w:lastRow="0" w:noHBand="0" w:noVBand="1" w:val="04A0"/>
         <w:tblBorders>
           <w:top w:val="dashed" w:sz="8" w:space="0" w:color="BF8F00"/>
           <w:left w:val="dashed" w:sz="8" w:space="0" w:color="BF8F00"/>
@@ -4438,6 +4437,7 @@
           <w:insideV w:val="dashed" w:sz="8" w:space="0" w:color="BF8F00"/>
         </w:tblBorders>
         <w:tblLayout w:type="fixed"/>
+        <w:tblLook w:firstColumn="1" w:firstRow="1" w:lastColumn="0" w:lastRow="0" w:noHBand="0" w:noVBand="1" w:val="04A0"/>
       </w:tblPr>
       <w:tblGrid>
         <w:gridCol w:w="8965"/>
@@ -4633,7 +4633,6 @@
       <w:tblPr>
         <w:tblStyle w:val="TableGrid"/>
         <w:tblW w:type="dxa" w:w="8965"/>
-        <w:tblLook w:firstColumn="1" w:firstRow="1" w:lastColumn="0" w:lastRow="0" w:noHBand="0" w:noVBand="1" w:val="04A0"/>
         <w:tblBorders>
           <w:top w:val="dashed" w:sz="8" w:space="0" w:color="BF8F00"/>
           <w:left w:val="dashed" w:sz="8" w:space="0" w:color="BF8F00"/>
@@ -4643,6 +4642,7 @@
           <w:insideV w:val="dashed" w:sz="8" w:space="0" w:color="BF8F00"/>
         </w:tblBorders>
         <w:tblLayout w:type="fixed"/>
+        <w:tblLook w:firstColumn="1" w:firstRow="1" w:lastColumn="0" w:lastRow="0" w:noHBand="0" w:noVBand="1" w:val="04A0"/>
       </w:tblPr>
       <w:tblGrid>
         <w:gridCol w:w="8965"/>
@@ -4802,7 +4802,6 @@
       <w:tblPr>
         <w:tblStyle w:val="TableGrid"/>
         <w:tblW w:type="dxa" w:w="8965"/>
-        <w:tblLook w:firstColumn="1" w:firstRow="1" w:lastColumn="0" w:lastRow="0" w:noHBand="0" w:noVBand="1" w:val="04A0"/>
         <w:tblBorders>
           <w:top w:val="dashed" w:sz="8" w:space="0" w:color="BF8F00"/>
           <w:left w:val="dashed" w:sz="8" w:space="0" w:color="BF8F00"/>
@@ -4812,6 +4811,7 @@
           <w:insideV w:val="dashed" w:sz="8" w:space="0" w:color="BF8F00"/>
         </w:tblBorders>
         <w:tblLayout w:type="fixed"/>
+        <w:tblLook w:firstColumn="1" w:firstRow="1" w:lastColumn="0" w:lastRow="0" w:noHBand="0" w:noVBand="1" w:val="04A0"/>
       </w:tblPr>
       <w:tblGrid>
         <w:gridCol w:w="8965"/>
@@ -4971,7 +4971,6 @@
       <w:tblPr>
         <w:tblStyle w:val="TableGrid"/>
         <w:tblW w:type="dxa" w:w="8965"/>
-        <w:tblLook w:firstColumn="1" w:firstRow="1" w:lastColumn="0" w:lastRow="0" w:noHBand="0" w:noVBand="1" w:val="04A0"/>
         <w:tblBorders>
           <w:top w:val="dashed" w:sz="8" w:space="0" w:color="BF8F00"/>
           <w:left w:val="dashed" w:sz="8" w:space="0" w:color="BF8F00"/>
@@ -4981,6 +4980,7 @@
           <w:insideV w:val="dashed" w:sz="8" w:space="0" w:color="BF8F00"/>
         </w:tblBorders>
         <w:tblLayout w:type="fixed"/>
+        <w:tblLook w:firstColumn="1" w:firstRow="1" w:lastColumn="0" w:lastRow="0" w:noHBand="0" w:noVBand="1" w:val="04A0"/>
       </w:tblPr>
       <w:tblGrid>
         <w:gridCol w:w="8965"/>

</xml_diff>